<commit_message>
Add PII tokenization: update EPIC-1, EPIC-2, add STORY-1.7, update design doc and open questions
</commit_message>
<xml_diff>
--- a/docs/JHA_PayCenter_Bridge_Design_Document.docx
+++ b/docs/JHA_PayCenter_Bridge_Design_Document.docx
@@ -5108,7 +5108,7 @@
           <w:sz w:val="22"/>
           <w:szCs w:val="22"/>
         </w:rPr>
-        <w:t xml:space="preserve">Build the core Python service that connects to the JH EES Kafka topic, consumes Event 800 messages, and prepares them for publishing.</w:t>
+        <w:t xml:space="preserve">Build the core Python service that connects to the JH EES Kafka topic, consumes Event 800 messages for Zelle, RTP, and FedNow, tokenizes PII fields in-flight, and publishes sanitized events to GCP Pub/Sub.</w:t>
       </w:r>
     </w:p>
     <w:p>
@@ -5239,7 +5239,7 @@
           <w:sz w:val="22"/>
           <w:szCs w:val="22"/>
         </w:rPr>
-        <w:t xml:space="preserve">FR-1.6  –  The service SHALL commit Kafka offsets only after a message has been successfully published to Pub/Sub (at-least-once delivery guarantee).</w:t>
+        <w:t xml:space="preserve">FR-1.6  –  The service SHALL tokenize PII fields (tokenValue, displayName, memo) in-flight before publishing to Pub/Sub. Plain-text PII values must never appear in the published payload, logs, or metrics.</w:t>
       </w:r>
     </w:p>
     <w:p>
@@ -5257,30 +5257,8 @@
           <w:sz w:val="22"/>
           <w:szCs w:val="22"/>
         </w:rPr>
-        <w:t xml:space="preserve">FR-1.7  –  The service SHALL route messages that fail JSON parsing or schema validation to the Pub/Sub dead letter topic, with the original raw bytes preserved.</w:t>
-      </w:r>
-    </w:p>
-    <w:p>
-      <w:pPr>
-        <w:spacing w:after="80"/>
-      </w:pPr>
-      <w:r>
-        <w:t xml:space="preserve"/>
-      </w:r>
-    </w:p>
-    <w:p>
-      <w:pPr>
-        <w:pStyle w:val="Heading3"/>
-      </w:pPr>
-      <w:r>
-        <w:rPr>
-          <w:rFonts w:ascii="Arial" w:cs="Arial" w:eastAsia="Arial" w:hAnsi="Arial"/>
-          <w:b/>
-          <w:bCs/>
-          <w:sz w:val="24"/>
-          <w:szCs w:val="24"/>
-        </w:rPr>
-        <w:t xml:space="preserve">Non-Functional Requirements</w:t>
+        <w:t xml:space="preserve">FR-1.7  –  Tokenization SHALL be deterministic: the same input value always produces the same token, enabling downstream correlation without exposing PII.
+      </w:t>
       </w:r>
     </w:p>
     <w:p>
@@ -5298,7 +5276,30 @@
           <w:sz w:val="22"/>
           <w:szCs w:val="22"/>
         </w:rPr>
-        <w:t xml:space="preserve">NFR-1.1  –  Consumer poll loop latency from Kafka receipt to Pub/Sub publish SHALL be under 2 seconds at p99 under normal load.</w:t>
+        <w:t xml:space="preserve">FR-1.8  –  The service SHALL commit Kafka offsets only after a message has been successfully published to Pub/Sub (at-least-once delivery guarantee).</w:t>
+      </w:r>
+    </w:p>
+    <w:p>
+      <w:pPr>
+        <w:spacing w:after="80"/>
+      </w:pPr>
+      <w:r>
+        <w:t xml:space="preserve"/>
+      </w:r>
+    </w:p>
+    <w:p>
+      <w:pPr>
+        <w:pStyle w:val="Heading3"/>
+      </w:pPr>
+      <w:r>
+        <w:rPr>
+          <w:rFonts w:ascii="Arial" w:cs="Arial" w:eastAsia="Arial" w:hAnsi="Arial"/>
+          <w:b/>
+          <w:bCs/>
+          <w:sz w:val="24"/>
+          <w:szCs w:val="24"/>
+        </w:rPr>
+        <w:t xml:space="preserve">Non-Functional Requirements</w:t>
       </w:r>
     </w:p>
     <w:p>
@@ -5316,7 +5317,7 @@
           <w:sz w:val="22"/>
           <w:szCs w:val="22"/>
         </w:rPr>
-        <w:t xml:space="preserve">NFR-1.2  –  The service SHALL handle Kafka broker disconnects and reconnect automatically with exponential backoff (max 60 seconds).</w:t>
+        <w:t xml:space="preserve">NFR-1.1  –  Consumer poll loop latency from Kafka receipt to Pub/Sub publish (including tokenization) SHALL be under 2 seconds at p99 under normal load.</w:t>
       </w:r>
     </w:p>
     <w:p>
@@ -5334,7 +5335,25 @@
           <w:sz w:val="22"/>
           <w:szCs w:val="22"/>
         </w:rPr>
-        <w:t xml:space="preserve">NFR-1.3  –  The service SHALL emit structured JSON logs for every consumed message, including eventId, pmtRailType, paymentStatus, and processing outcome.</w:t>
+        <w:t xml:space="preserve">NFR-1.2  –  The service SHALL handle Kafka broker disconnects and reconnect automatically with exponential backoff (max 60 seconds).</w:t>
+      </w:r>
+    </w:p>
+    <w:p>
+      <w:pPr>
+        <w:pStyle w:val="ListParagraph"/>
+        <w:numPr>
+          <w:ilvl w:val="0"/>
+          <w:numId w:val="2"/>
+        </w:numPr>
+        <w:spacing w:after="80"/>
+      </w:pPr>
+      <w:r>
+        <w:rPr>
+          <w:rFonts w:ascii="Arial" w:cs="Arial" w:eastAsia="Arial" w:hAnsi="Arial"/>
+          <w:sz w:val="22"/>
+          <w:szCs w:val="22"/>
+        </w:rPr>
+        <w:t xml:space="preserve">NFR-1.3  –  The service SHALL emit structured JSON logs for every consumed message, including eventId, pmtRailType, paymentStatus, and processing outcome. Logs SHALL never contain plain-text PII values.</w:t>
       </w:r>
     </w:p>
     <w:p>
@@ -5393,7 +5412,8 @@
           <w:sz w:val="22"/>
           <w:szCs w:val="22"/>
         </w:rPr>
-        <w:t xml:space="preserve">A test Zelle, RTP, and FedNow Event 800 message injected into Kafka each appear in Pub/Sub within 2 seconds.</w:t>
+        <w:t xml:space="preserve">A test Zelle, RTP, and FedNow Event 800 message injected into Kafka each appear in Pub/Sub within 2 seconds.
+      </w:t>
       </w:r>
     </w:p>
     <w:p>
@@ -5411,7 +5431,7 @@
           <w:sz w:val="22"/>
           <w:szCs w:val="22"/>
         </w:rPr>
-        <w:t xml:space="preserve">An Event 800 message with an unknown rail type is consumed and discarded – not published to Pub/Sub.</w:t>
+        <w:t xml:space="preserve">Published Pub/Sub messages contain tokenized values for tokenValue, displayName, and memo. No plain-text PII is present in the published payload.</w:t>
       </w:r>
     </w:p>
     <w:p>
@@ -5429,6 +5449,24 @@
           <w:sz w:val="22"/>
           <w:szCs w:val="22"/>
         </w:rPr>
+        <w:t xml:space="preserve">An Event 800 message with an unknown rail type is consumed and discarded – not published to Pub/Sub.</w:t>
+      </w:r>
+    </w:p>
+    <w:p>
+      <w:pPr>
+        <w:pStyle w:val="ListParagraph"/>
+        <w:numPr>
+          <w:ilvl w:val="0"/>
+          <w:numId w:val="3"/>
+        </w:numPr>
+        <w:spacing w:after="80"/>
+      </w:pPr>
+      <w:r>
+        <w:rPr>
+          <w:rFonts w:ascii="Arial" w:cs="Arial" w:eastAsia="Arial" w:hAnsi="Arial"/>
+          <w:sz w:val="22"/>
+          <w:szCs w:val="22"/>
+        </w:rPr>
         <w:t xml:space="preserve">A malformed JSON message is routed to the dead letter topic without crashing the service.</w:t>
       </w:r>
     </w:p>
@@ -5478,7 +5516,7 @@
           <w:sz w:val="22"/>
           <w:szCs w:val="22"/>
         </w:rPr>
-        <w:t xml:space="preserve">Configure GCP Pub/Sub resources and implement the publishing logic, including message attributes and dead letter handling.</w:t>
+        <w:t xml:space="preserve">Configure GCP Pub/Sub resources and implement the publishing logic. All messages published to Pub/Sub contain tokenized PII – no plain-text personal data reaches downstream consumers.</w:t>
       </w:r>
     </w:p>
     <w:p>
@@ -5519,7 +5557,7 @@
           <w:sz w:val="22"/>
           <w:szCs w:val="22"/>
         </w:rPr>
-        <w:t xml:space="preserve">FR-2.1  –  The service SHALL publish each valid Event 800 message as a Pub/Sub message to the topic payment-events, with the raw JSON Event 800 payload as the message body.</w:t>
+        <w:t xml:space="preserve">FR-2.1  –  The service SHALL publish each valid, PII-tokenized Event 800 message to the payment-events Pub/Sub topic. The message body SHALL be the sanitized JSON payload with all PII fields replaced by opaque tokens.</w:t>
       </w:r>
     </w:p>
     <w:p>
@@ -7664,7 +7702,92 @@
                 <w:sz w:val="20"/>
                 <w:szCs w:val="20"/>
               </w:rPr>
-              <w:t xml:space="preserve">Target GCP project IDs, region, and naming conventions are not yet defined.</w:t>
+              <w:t xml:space="preserve">Target GCP project IDs, region, and naming conventions are not yet defined.
+      </w:t>
+            </w:r>
+          </w:p>
+        </w:tc>
+      </w:tr>
+      <w:tr>
+        <w:tc>
+          <w:tcPr>
+            <w:tcBorders>
+              <w:top w:val="single" w:sz="1" w:color="CCCCCC"/>
+              <w:bottom w:val="single" w:sz="1" w:color="CCCCCC"/>
+              <w:left w:val="single" w:sz="1" w:color="CCCCCC"/>
+              <w:right w:val="single" w:sz="1" w:color="CCCCCC"/>
+            </w:tcBorders>
+            <w:shading w:fill="F5F5F5" w:val="clear"/>
+            <w:tcMar>
+              <w:top w:type="dxa" w:w="80"/>
+              <w:left w:type="dxa" w:w="120"/>
+              <w:bottom w:type="dxa" w:w="80"/>
+              <w:right w:type="dxa" w:w="120"/>
+            </w:tcMar>
+          </w:tcPr>
+          <w:p>
+            <w:r>
+              <w:rPr>
+                <w:rFonts w:ascii="Arial" w:cs="Arial" w:eastAsia="Arial" w:hAnsi="Arial"/>
+                <w:b/>
+                <w:sz w:val="20"/>
+                <w:szCs w:val="20"/>
+              </w:rPr>
+              <w:t xml:space="preserve">8</w:t>
+            </w:r>
+          </w:p>
+        </w:tc>
+        <w:tc>
+          <w:tcPr>
+            <w:tcBorders>
+              <w:top w:val="single" w:sz="1" w:color="CCCCCC"/>
+              <w:bottom w:val="single" w:sz="1" w:color="CCCCCC"/>
+              <w:left w:val="single" w:sz="1" w:color="CCCCCC"/>
+              <w:right w:val="single" w:sz="1" w:color="CCCCCC"/>
+            </w:tcBorders>
+            <w:shading w:fill="F5F5F5" w:val="clear"/>
+            <w:tcMar>
+              <w:top w:type="dxa" w:w="80"/>
+              <w:left w:type="dxa" w:w="120"/>
+              <w:bottom w:type="dxa" w:w="80"/>
+              <w:right w:type="dxa" w:w="120"/>
+            </w:tcMar>
+          </w:tcPr>
+          <w:p>
+            <w:r>
+              <w:rPr>
+                <w:rFonts w:ascii="Arial" w:cs="Arial" w:eastAsia="Arial" w:hAnsi="Arial"/>
+                <w:sz w:val="20"/>
+                <w:szCs w:val="20"/>
+              </w:rPr>
+              <w:t xml:space="preserve">PII tokenization approach is not yet decided. Candidate options include Google Cloud DLP, HashiCorp Vault Transit, format-preserving encryption (FPE), or HMAC-SHA256. Choice affects latency, reversibility, infrastructure cost, and audit requirements.</w:t>
+            </w:r>
+          </w:p>
+        </w:tc>
+        <w:tc>
+          <w:tcPr>
+            <w:tcBorders>
+              <w:top w:val="single" w:sz="1" w:color="CCCCCC"/>
+              <w:bottom w:val="single" w:sz="1" w:color="CCCCCC"/>
+              <w:left w:val="single" w:sz="1" w:color="CCCCCC"/>
+              <w:right w:val="single" w:sz="1" w:color="CCCCCC"/>
+            </w:tcBorders>
+            <w:shading w:fill="F5F5F5" w:val="clear"/>
+            <w:tcMar>
+              <w:top w:type="dxa" w:w="80"/>
+              <w:left w:type="dxa" w:w="120"/>
+              <w:bottom w:type="dxa" w:w="80"/>
+              <w:right w:type="dxa" w:w="120"/>
+            </w:tcMar>
+          </w:tcPr>
+          <w:p>
+            <w:r>
+              <w:rPr>
+                <w:rFonts w:ascii="Arial" w:cs="Arial" w:eastAsia="Arial" w:hAnsi="Arial"/>
+                <w:sz w:val="20"/>
+                <w:szCs w:val="20"/>
+              </w:rPr>
+              <w:t xml:space="preserve">Architecture review required before STORY-1.7 can be started. Decision must cover: determinism, reversibility, latency target, key management, and audit logging requirements.</w:t>
             </w:r>
           </w:p>
         </w:tc>

</xml_diff>